<commit_message>
Add Lab 2 notebook, dataset, and completed report
Co-Authored-By: Claude Opus 5.5 <noreply@anthropic.com>
</commit_message>
<xml_diff>
--- a/LAB-2/262240016_Experiment_2_Data_Preprocessing_Report.docx
+++ b/LAB-2/262240016_Experiment_2_Data_Preprocessing_Report.docx
@@ -1285,6 +1285,20 @@
       </w:r>
     </w:p>
     <w:p>
+      <w:r>
+        <w:t xml:space="preserve">The cleaning and transforming steps are done </w:t>
+      </w:r>
+      <w:r>
+        <w:rPr>
+          <w:b/>
+        </w:rPr>
+        <w:t xml:space="preserve">before</w:t>
+      </w:r>
+      <w:r>
+        <w:t xml:space="preserve"> selecting and filtering, because filters such as "fresher jobs" or "jobs that need Python" only work after the experience text has been converted to numbers and the skill columns have been created.</w:t>
+      </w:r>
+    </w:p>
+    <w:p>
       <w:pPr>
         <w:pStyle w:val="Heading2"/>
       </w:pPr>
@@ -1358,11 +1372,16 @@
         <w:t xml:space="preserve">Result: </w:t>
       </w:r>
       <w:r>
+        <w:t xml:space="preserve">The dataset has </w:t>
+      </w:r>
+      <w:r>
         <w:rPr>
-          <w:i/>
-          <w:color w:val="7F7F7F"/>
+          <w:b/>
         </w:rPr>
-        <w:t xml:space="preserve">to be added after running the notebook.</w:t>
+        <w:t xml:space="preserve">12,000 job postings and 5 columns</w:t>
+      </w:r>
+      <w:r>
+        <w:t xml:space="preserve">, and all 5 columns are stored as text. There are no empty cells and no exact duplicate rows, but some values are wrong (see Step 2).</w:t>
       </w:r>
     </w:p>
     <w:p>
@@ -1381,6 +1400,14 @@
         <w:pStyle w:val="ListBullet"/>
       </w:pPr>
       <w:r>
+        <w:t xml:space="preserve">Rename the columns to short, simple names (Job_Title, Company, Location, Experience, Skills).</w:t>
+      </w:r>
+    </w:p>
+    <w:p>
+      <w:pPr>
+        <w:pStyle w:val="ListBullet"/>
+      </w:pPr>
+      <w:r>
         <w:t xml:space="preserve">Find the experience values that are not in "min-max" years format and mark them as missing (NaN).</w:t>
       </w:r>
     </w:p>
@@ -1389,7 +1416,7 @@
         <w:pStyle w:val="ListBullet"/>
       </w:pPr>
       <w:r>
-        <w:t xml:space="preserve">Decide how to handle these rows (remove or fill) and explain why.</w:t>
+        <w:t xml:space="preserve">Remove these rows with dropna(), because their experience cannot be guessed.</w:t>
       </w:r>
     </w:p>
     <w:p>
@@ -1397,15 +1424,7 @@
         <w:pStyle w:val="ListBullet"/>
       </w:pPr>
       <w:r>
-        <w:t xml:space="preserve">Clean extra spaces in text columns.</w:t>
-      </w:r>
-    </w:p>
-    <w:p>
-      <w:pPr>
-        <w:pStyle w:val="ListBullet"/>
-      </w:pPr>
-      <w:r>
-        <w:t xml:space="preserve">Check for and remove duplicate rows.</w:t>
+        <w:t xml:space="preserve">Find duplicate rows that differ only in capital letters or extra spaces, and remove them.</w:t>
       </w:r>
     </w:p>
     <w:tbl>
@@ -1440,7 +1459,7 @@
                 <w:b/>
                 <w:color w:val="5A5A5A"/>
               </w:rPr>
-              <w:t>SCREENSHOT PLACEHOLDER — Unwanted experience values and how they were handled</w:t>
+              <w:t>SCREENSHOT PLACEHOLDER — Invalid experience values, dropna() and duplicate removal</w:t>
             </w:r>
           </w:p>
         </w:tc>
@@ -1456,10 +1475,30 @@
       </w:r>
       <w:r>
         <w:rPr>
-          <w:i/>
-          <w:color w:val="7F7F7F"/>
+          <w:b/>
         </w:rPr>
-        <w:t xml:space="preserve">to be added after running the notebook.</w:t>
+        <w:t xml:space="preserve">7 jobs</w:t>
+      </w:r>
+      <w:r>
+        <w:t xml:space="preserve"> had a date or a degree instead of years of experience (e.g. "12 May - 21 May", "B.Tech/B.E."). They were marked as missing and removed. </w:t>
+      </w:r>
+      <w:r>
+        <w:rPr>
+          <w:b/>
+        </w:rPr>
+        <w:t xml:space="preserve">2 more rows</w:t>
+      </w:r>
+      <w:r>
+        <w:t xml:space="preserve"> were duplicates that differed only in capital letters or spaces, and were also removed. </w:t>
+      </w:r>
+      <w:r>
+        <w:rPr>
+          <w:b/>
+        </w:rPr>
+        <w:t xml:space="preserve">11,991 rows</w:t>
+      </w:r>
+      <w:r>
+        <w:t xml:space="preserve"> are left.</w:t>
       </w:r>
     </w:p>
     <w:p>
@@ -1478,7 +1517,7 @@
         <w:pStyle w:val="ListBullet"/>
       </w:pPr>
       <w:r>
-        <w:t xml:space="preserve">Split "Job Experience" (e.g. "3-6") into two number columns: Min_Experience and Max_Experience.</w:t>
+        <w:t xml:space="preserve">Split "Experience" (e.g. "3-6") into two number columns: Min_Exp and Max_Exp, and convert them from text to numbers with astype(int).</w:t>
       </w:r>
     </w:p>
     <w:p>
@@ -1486,7 +1525,7 @@
         <w:pStyle w:val="ListBullet"/>
       </w:pPr>
       <w:r>
-        <w:t xml:space="preserve">Standardise city names (e.g. "Bangalore/Bengaluru" and "Bengaluru" → "Bengaluru").</w:t>
+        <w:t xml:space="preserve">Standardise city names using a dictionary (e.g. "Bangalore/Bengaluru" and "Bengaluru" → "Bengaluru"; "Mumbai (All Areas)", "Navi Mumbai" → "Mumbai").</w:t>
       </w:r>
     </w:p>
     <w:p>
@@ -1494,7 +1533,7 @@
         <w:pStyle w:val="ListBullet"/>
       </w:pPr>
       <w:r>
-        <w:t xml:space="preserve">Convert the skills text into lower case and into a proper list of skills.</w:t>
+        <w:t xml:space="preserve">Convert the skills text into a clean list: lower case, extra spaces removed, and the general "it skills" tag removed.</w:t>
       </w:r>
     </w:p>
     <w:tbl>
@@ -1544,11 +1583,7 @@
         <w:t xml:space="preserve">Result: </w:t>
       </w:r>
       <w:r>
-        <w:rPr>
-          <w:i/>
-          <w:color w:val="7F7F7F"/>
-        </w:rPr>
-        <w:t xml:space="preserve">to be added after running the notebook.</w:t>
+        <w:t xml:space="preserve">Experience is now stored as numbers, so it can be compared and grouped. Different spellings of the same city now have one name, and each job's skills are a clean list that can be counted.</w:t>
       </w:r>
     </w:p>
     <w:p>
@@ -1570,10 +1605,10 @@
         <w:rPr>
           <w:b/>
         </w:rPr>
-        <w:t xml:space="preserve">Avg_Experience:</w:t>
+        <w:t xml:space="preserve">Avg_Exp:</w:t>
       </w:r>
       <w:r>
-        <w:t xml:space="preserve"> average of minimum and maximum experience.</w:t>
+        <w:t xml:space="preserve"> average of the minimum and maximum experience.</w:t>
       </w:r>
     </w:p>
     <w:p>
@@ -1587,7 +1622,7 @@
         <w:t xml:space="preserve">Experience_Level:</w:t>
       </w:r>
       <w:r>
-        <w:t xml:space="preserve"> Fresher / Junior / Mid / Senior, created by binning the minimum experience.</w:t>
+        <w:t xml:space="preserve"> Fresher (0-1), Junior (2-3), Mid (4-6) or Senior (7+), created by binning the minimum experience with pd.cut().</w:t>
       </w:r>
     </w:p>
     <w:p>
@@ -1601,7 +1636,7 @@
         <w:t xml:space="preserve">Role:</w:t>
       </w:r>
       <w:r>
-        <w:t xml:space="preserve"> a simple role group (Data Scientist / Data Engineer / Data Analyst / Other) created from the job title.</w:t>
+        <w:t xml:space="preserve"> thousands of job titles grouped into 6 roles (Data / Business Analyst, Data Engineer, Data Scientist, ML / AI Engineer, Software Developer, Other) using keywords in the title.</w:t>
       </w:r>
     </w:p>
     <w:p>
@@ -1626,10 +1661,10 @@
         <w:rPr>
           <w:b/>
         </w:rPr>
-        <w:t xml:space="preserve">Needs_Python, Needs_SQL, Needs_ML …:</w:t>
+        <w:t xml:space="preserve">Skill_Count:</w:t>
       </w:r>
       <w:r>
-        <w:t xml:space="preserve"> Yes/No columns showing whether a skill is asked for.</w:t>
+        <w:t xml:space="preserve"> number of skills listed in the job.</w:t>
       </w:r>
     </w:p>
     <w:p>
@@ -1640,10 +1675,10 @@
         <w:rPr>
           <w:b/>
         </w:rPr>
-        <w:t xml:space="preserve">Skill_Count:</w:t>
+        <w:t xml:space="preserve">Needs_Python, Needs_Sql, Needs_Machine_Learning, Needs_Excel, Needs_Power_Bi, Needs_Tableau, Needs_Aws:</w:t>
       </w:r>
       <w:r>
-        <w:t xml:space="preserve"> number of skills listed in the job.</w:t>
+        <w:t xml:space="preserve"> True/False columns showing whether the job asks for that skill.</w:t>
       </w:r>
     </w:p>
     <w:tbl>
@@ -1693,11 +1728,7 @@
         <w:t xml:space="preserve">Result: </w:t>
       </w:r>
       <w:r>
-        <w:rPr>
-          <w:i/>
-          <w:color w:val="7F7F7F"/>
-        </w:rPr>
-        <w:t xml:space="preserve">to be added after running the notebook.</w:t>
+        <w:t xml:space="preserve">The new columns turn long text into simple groups and True/False values, which can be counted, filtered and plotted directly.</w:t>
       </w:r>
     </w:p>
     <w:p>
@@ -1716,7 +1747,7 @@
         <w:pStyle w:val="ListBullet"/>
       </w:pPr>
       <w:r>
-        <w:t xml:space="preserve">Select only the columns needed for analysis using loc[].</w:t>
+        <w:t xml:space="preserve">Select only the columns needed for analysis by their names, using loc[].</w:t>
       </w:r>
     </w:p>
     <w:p>
@@ -1724,7 +1755,7 @@
         <w:pStyle w:val="ListBullet"/>
       </w:pPr>
       <w:r>
-        <w:t xml:space="preserve">Select specific rows by position using iloc[].</w:t>
+        <w:t xml:space="preserve">Select rows and columns by their position, using iloc[].</w:t>
       </w:r>
     </w:p>
     <w:tbl>
@@ -1774,11 +1805,7 @@
         <w:t xml:space="preserve">Result: </w:t>
       </w:r>
       <w:r>
-        <w:rPr>
-          <w:i/>
-          <w:color w:val="7F7F7F"/>
-        </w:rPr>
-        <w:t xml:space="preserve">to be added after running the notebook.</w:t>
+        <w:t xml:space="preserve">loc[] kept 10 useful columns by name. iloc[0:5, 0:3] selected the first 5 rows and first 3 columns by position.</w:t>
       </w:r>
     </w:p>
     <w:p>
@@ -1805,7 +1832,7 @@
         <w:pStyle w:val="ListBullet"/>
       </w:pPr>
       <w:r>
-        <w:t xml:space="preserve">Jobs located in Mumbai.</w:t>
+        <w:t xml:space="preserve">Jobs that list Mumbai as one of their cities.</w:t>
       </w:r>
     </w:p>
     <w:p>
@@ -1813,7 +1840,7 @@
         <w:pStyle w:val="ListBullet"/>
       </w:pPr>
       <w:r>
-        <w:t xml:space="preserve">Jobs that need both Python and SQL.</w:t>
+        <w:t xml:space="preserve">Jobs that need both Python and SQL (using &amp;).</w:t>
       </w:r>
     </w:p>
     <w:p>
@@ -1821,7 +1848,15 @@
         <w:pStyle w:val="ListBullet"/>
       </w:pPr>
       <w:r>
-        <w:t xml:space="preserve">Data Analyst jobs in selected cities (using isin()).</w:t>
+        <w:t xml:space="preserve">Data / Business Analyst jobs whose main city is Mumbai or Pune (using isin()).</w:t>
+      </w:r>
+    </w:p>
+    <w:p>
+      <w:pPr>
+        <w:pStyle w:val="ListBullet"/>
+      </w:pPr>
+      <w:r>
+        <w:t xml:space="preserve">Fresher jobs whose main city is Mumbai (using query()).</w:t>
       </w:r>
     </w:p>
     <w:tbl>
@@ -1863,6 +1898,159 @@
       </w:tr>
     </w:tbl>
     <w:p/>
+    <w:tbl>
+      <w:tblPr>
+        <w:tblStyle w:val="TableGrid"/>
+        <w:tblW w:type="dxa" w:w="9936"/>
+        <w:jc w:val="center"/>
+        <w:tblLook w:firstColumn="1" w:firstRow="1" w:lastColumn="0" w:lastRow="0" w:noHBand="0" w:noVBand="1" w:val="04A0"/>
+      </w:tblPr>
+      <w:tblGrid>
+        <w:gridCol w:w="6624"/>
+        <w:gridCol w:w="3312"/>
+      </w:tblGrid>
+      <w:tr>
+        <w:tc>
+          <w:tcPr>
+            <w:tcW w:type="dxa" w:w="6624"/>
+            <w:shd w:val="clear" w:color="auto" w:fill="D9E2F3"/>
+          </w:tcPr>
+          <w:p>
+            <w:r>
+              <w:rPr>
+                <w:b/>
+              </w:rPr>
+              <w:t xml:space="preserve">Filter</w:t>
+            </w:r>
+          </w:p>
+        </w:tc>
+        <w:tc>
+          <w:tcPr>
+            <w:tcW w:type="dxa" w:w="3312"/>
+            <w:shd w:val="clear" w:color="auto" w:fill="D9E2F3"/>
+          </w:tcPr>
+          <w:p>
+            <w:r>
+              <w:rPr>
+                <w:b/>
+              </w:rPr>
+              <w:t xml:space="preserve">Number of jobs</w:t>
+            </w:r>
+          </w:p>
+        </w:tc>
+      </w:tr>
+      <w:tr>
+        <w:tc>
+          <w:tcPr>
+            <w:tcW w:type="dxa" w:w="6624"/>
+          </w:tcPr>
+          <w:p>
+            <w:r>
+              <w:t xml:space="preserve">Open to freshers (0-1 years)</w:t>
+            </w:r>
+          </w:p>
+        </w:tc>
+        <w:tc>
+          <w:tcPr>
+            <w:tcW w:type="dxa" w:w="3312"/>
+          </w:tcPr>
+          <w:p>
+            <w:r>
+              <w:t xml:space="preserve">1,480</w:t>
+            </w:r>
+          </w:p>
+        </w:tc>
+      </w:tr>
+      <w:tr>
+        <w:tc>
+          <w:tcPr>
+            <w:tcW w:type="dxa" w:w="6624"/>
+          </w:tcPr>
+          <w:p>
+            <w:r>
+              <w:t xml:space="preserve">List Mumbai as a city</w:t>
+            </w:r>
+          </w:p>
+        </w:tc>
+        <w:tc>
+          <w:tcPr>
+            <w:tcW w:type="dxa" w:w="3312"/>
+          </w:tcPr>
+          <w:p>
+            <w:r>
+              <w:t xml:space="preserve">1,480</w:t>
+            </w:r>
+          </w:p>
+        </w:tc>
+      </w:tr>
+      <w:tr>
+        <w:tc>
+          <w:tcPr>
+            <w:tcW w:type="dxa" w:w="6624"/>
+          </w:tcPr>
+          <w:p>
+            <w:r>
+              <w:t xml:space="preserve">Need both Python and SQL</w:t>
+            </w:r>
+          </w:p>
+        </w:tc>
+        <w:tc>
+          <w:tcPr>
+            <w:tcW w:type="dxa" w:w="3312"/>
+          </w:tcPr>
+          <w:p>
+            <w:r>
+              <w:t xml:space="preserve">661</w:t>
+            </w:r>
+          </w:p>
+        </w:tc>
+      </w:tr>
+      <w:tr>
+        <w:tc>
+          <w:tcPr>
+            <w:tcW w:type="dxa" w:w="6624"/>
+          </w:tcPr>
+          <w:p>
+            <w:r>
+              <w:t xml:space="preserve">Analyst jobs in Mumbai or Pune</w:t>
+            </w:r>
+          </w:p>
+        </w:tc>
+        <w:tc>
+          <w:tcPr>
+            <w:tcW w:type="dxa" w:w="3312"/>
+          </w:tcPr>
+          <w:p>
+            <w:r>
+              <w:t xml:space="preserve">927</w:t>
+            </w:r>
+          </w:p>
+        </w:tc>
+      </w:tr>
+      <w:tr>
+        <w:tc>
+          <w:tcPr>
+            <w:tcW w:type="dxa" w:w="6624"/>
+          </w:tcPr>
+          <w:p>
+            <w:r>
+              <w:t xml:space="preserve">Fresher jobs with Mumbai as main city</w:t>
+            </w:r>
+          </w:p>
+        </w:tc>
+        <w:tc>
+          <w:tcPr>
+            <w:tcW w:type="dxa" w:w="3312"/>
+          </w:tcPr>
+          <w:p>
+            <w:r>
+              <w:t xml:space="preserve">216</w:t>
+            </w:r>
+          </w:p>
+        </w:tc>
+      </w:tr>
+    </w:tbl>
+    <w:p/>
     <w:p>
       <w:r>
         <w:rPr>
@@ -1871,11 +2059,7 @@
         <w:t xml:space="preserve">Result: </w:t>
       </w:r>
       <w:r>
-        <w:rPr>
-          <w:i/>
-          <w:color w:val="7F7F7F"/>
-        </w:rPr>
-        <w:t xml:space="preserve">to be added after running the notebook.</w:t>
+        <w:t xml:space="preserve">Filtering creates small, focused groups for specific questions. The fresher and Mumbai counts are equal only by coincidence: they are different jobs, and just 245 jobs are in both groups.</w:t>
       </w:r>
     </w:p>
     <w:p>
@@ -1894,7 +2078,7 @@
         <w:pStyle w:val="ListBullet"/>
       </w:pPr>
       <w:r>
-        <w:t xml:space="preserve">Save the final clean dataset as a new CSV file.</w:t>
+        <w:t xml:space="preserve">Keep only the useful columns, sort the rows by minimum experience, and save the final clean dataset as cleaned_ds_jobs_india.csv (11,991 rows, 16 columns).</w:t>
       </w:r>
     </w:p>
     <w:p>
@@ -1902,48 +2086,127 @@
         <w:pStyle w:val="ListBullet"/>
       </w:pPr>
       <w:r>
-        <w:t xml:space="preserve">Create charts that were not possible with the raw data, for example: top 10 skills in demand, jobs by city, jobs by role, jobs by experience level, and skills asked for in fresher jobs.</w:t>
+        <w:t xml:space="preserve">Create charts that were wrong or not possible with the raw data.</w:t>
       </w:r>
     </w:p>
-    <w:tbl>
-      <w:tblPr>
-        <w:tblW w:type="auto" w:w="0"/>
+    <w:p>
+      <w:r>
+        <w:rPr>
+          <w:b/>
+        </w:rPr>
+        <w:t xml:space="preserve">Chart 1 — Jobs by City: Before vs After Cleaning</w:t>
+      </w:r>
+    </w:p>
+    <w:p>
+      <w:pPr>
         <w:jc w:val="center"/>
-        <w:tblLook w:firstColumn="1" w:firstRow="1" w:lastColumn="0" w:lastRow="0" w:noHBand="0" w:noVBand="1" w:val="04A0"/>
-      </w:tblPr>
-      <w:tblGrid>
-        <w:gridCol w:w="9936"/>
-      </w:tblGrid>
-      <w:tr>
-        <w:tc>
-          <w:tcPr>
-            <w:tcW w:type="dxa" w:w="9216"/>
-            <w:vAlign w:val="center"/>
-            <w:shd w:fill="EDEDED"/>
-            <w:tcBorders>
-              <w:top w:val="single" w:sz="10" w:space="0" w:color="A6A6A6"/>
-              <w:left w:val="single" w:sz="10" w:space="0" w:color="A6A6A6"/>
-              <w:bottom w:val="single" w:sz="10" w:space="0" w:color="A6A6A6"/>
-              <w:right w:val="single" w:sz="10" w:space="0" w:color="A6A6A6"/>
-            </w:tcBorders>
-          </w:tcPr>
-          <w:p>
-            <w:pPr>
-              <w:spacing w:before="360" w:after="360"/>
-              <w:jc w:val="center"/>
-            </w:pPr>
-            <w:r>
-              <w:rPr>
-                <w:b/>
-                <w:color w:val="5A5A5A"/>
-              </w:rPr>
-              <w:t>SCREENSHOT PLACEHOLDER — Charts made from the transformed dataset</w:t>
-            </w:r>
-          </w:p>
-        </w:tc>
-      </w:tr>
-    </w:tbl>
-    <w:p/>
+      </w:pPr>
+      <w:r>
+        <w:drawing>
+          <wp:inline distT="0" distB="0" distL="0" distR="0">
+            <wp:extent cx="5760720" cy="1880100"/>
+            <wp:docPr id="101" name="Chart 1"/>
+            <wp:cNvGraphicFramePr>
+              <a:graphicFrameLocks xmlns:a="http://schemas.openxmlformats.org/drawingml/2006/main" noChangeAspect="1"/>
+            </wp:cNvGraphicFramePr>
+            <a:graphic xmlns:a="http://schemas.openxmlformats.org/drawingml/2006/main">
+              <a:graphicData uri="http://schemas.openxmlformats.org/drawingml/2006/picture">
+                <pic:pic xmlns:pic="http://schemas.openxmlformats.org/drawingml/2006/picture">
+                  <pic:nvPicPr>
+                    <pic:cNvPr id="0" name="chart1.png"/>
+                    <pic:cNvPicPr/>
+                  </pic:nvPicPr>
+                  <pic:blipFill>
+                    <a:blip r:embed="rIdImg1"/>
+                    <a:stretch>
+                      <a:fillRect/>
+                    </a:stretch>
+                  </pic:blipFill>
+                  <pic:spPr>
+                    <a:xfrm>
+                      <a:off x="0" y="0"/>
+                      <a:ext cx="5760720" cy="1880100"/>
+                    </a:xfrm>
+                    <a:prstGeom prst="rect">
+                      <a:avLst/>
+                    </a:prstGeom>
+                  </pic:spPr>
+                </pic:pic>
+              </a:graphicData>
+            </a:graphic>
+          </wp:inline>
+        </w:drawing>
+      </w:r>
+    </w:p>
+    <w:p>
+      <w:r>
+        <w:rPr>
+          <w:b/>
+        </w:rPr>
+        <w:t xml:space="preserve">Result: </w:t>
+      </w:r>
+      <w:r>
+        <w:t xml:space="preserve">Before cleaning, Bengaluru appears twice ("Bangalore/Bengaluru" with 3,382 jobs and "Bengaluru" with 342), and so does Hyderabad, so their counts are split. After cleaning, </w:t>
+      </w:r>
+      <w:r>
+        <w:rPr>
+          <w:b/>
+        </w:rPr>
+        <w:t xml:space="preserve">Bengaluru clearly leads with 3,818 jobs</w:t>
+      </w:r>
+      <w:r>
+        <w:t xml:space="preserve">, followed by Hyderabad (1,616), Pune (1,431) and Mumbai (1,155).</w:t>
+      </w:r>
+    </w:p>
+    <w:p>
+      <w:r>
+        <w:rPr>
+          <w:b/>
+        </w:rPr>
+        <w:t xml:space="preserve">Chart 2 — Top 15 Skills in Demand</w:t>
+      </w:r>
+    </w:p>
+    <w:p>
+      <w:pPr>
+        <w:jc w:val="center"/>
+      </w:pPr>
+      <w:r>
+        <w:drawing>
+          <wp:inline distT="0" distB="0" distL="0" distR="0">
+            <wp:extent cx="5120640" cy="2979380"/>
+            <wp:docPr id="102" name="Chart 2"/>
+            <wp:cNvGraphicFramePr>
+              <a:graphicFrameLocks xmlns:a="http://schemas.openxmlformats.org/drawingml/2006/main" noChangeAspect="1"/>
+            </wp:cNvGraphicFramePr>
+            <a:graphic xmlns:a="http://schemas.openxmlformats.org/drawingml/2006/main">
+              <a:graphicData uri="http://schemas.openxmlformats.org/drawingml/2006/picture">
+                <pic:pic xmlns:pic="http://schemas.openxmlformats.org/drawingml/2006/picture">
+                  <pic:nvPicPr>
+                    <pic:cNvPr id="0" name="chart2.png"/>
+                    <pic:cNvPicPr/>
+                  </pic:nvPicPr>
+                  <pic:blipFill>
+                    <a:blip r:embed="rIdImg2"/>
+                    <a:stretch>
+                      <a:fillRect/>
+                    </a:stretch>
+                  </pic:blipFill>
+                  <pic:spPr>
+                    <a:xfrm>
+                      <a:off x="0" y="0"/>
+                      <a:ext cx="5120640" cy="2979380"/>
+                    </a:xfrm>
+                    <a:prstGeom prst="rect">
+                      <a:avLst/>
+                    </a:prstGeom>
+                  </pic:spPr>
+                </pic:pic>
+              </a:graphicData>
+            </a:graphic>
+          </wp:inline>
+        </w:drawing>
+      </w:r>
+    </w:p>
     <w:p>
       <w:r>
         <w:rPr>
@@ -1953,10 +2216,222 @@
       </w:r>
       <w:r>
         <w:rPr>
-          <w:i/>
-          <w:color w:val="7F7F7F"/>
+          <w:b/>
         </w:rPr>
-        <w:t xml:space="preserve">to be added after running the notebook.</w:t>
+        <w:t xml:space="preserve">Python is the most wanted skill (3,147 jobs)</w:t>
+      </w:r>
+      <w:r>
+        <w:t xml:space="preserve">, far ahead of machine learning (1,777), data analysis (1,614) and SQL (1,524). Cloud and big-data skills (cloud, Spark, AWS) are also common. This chart needed the skills text to be split into a list first.</w:t>
+      </w:r>
+    </w:p>
+    <w:p>
+      <w:r>
+        <w:rPr>
+          <w:b/>
+        </w:rPr>
+        <w:t xml:space="preserve">Chart 3 — Jobs by Role</w:t>
+      </w:r>
+    </w:p>
+    <w:p>
+      <w:pPr>
+        <w:jc w:val="center"/>
+      </w:pPr>
+      <w:r>
+        <w:drawing>
+          <wp:inline distT="0" distB="0" distL="0" distR="0">
+            <wp:extent cx="5120640" cy="2667234"/>
+            <wp:docPr id="103" name="Chart 3"/>
+            <wp:cNvGraphicFramePr>
+              <a:graphicFrameLocks xmlns:a="http://schemas.openxmlformats.org/drawingml/2006/main" noChangeAspect="1"/>
+            </wp:cNvGraphicFramePr>
+            <a:graphic xmlns:a="http://schemas.openxmlformats.org/drawingml/2006/main">
+              <a:graphicData uri="http://schemas.openxmlformats.org/drawingml/2006/picture">
+                <pic:pic xmlns:pic="http://schemas.openxmlformats.org/drawingml/2006/picture">
+                  <pic:nvPicPr>
+                    <pic:cNvPr id="0" name="chart3.png"/>
+                    <pic:cNvPicPr/>
+                  </pic:nvPicPr>
+                  <pic:blipFill>
+                    <a:blip r:embed="rIdImg3"/>
+                    <a:stretch>
+                      <a:fillRect/>
+                    </a:stretch>
+                  </pic:blipFill>
+                  <pic:spPr>
+                    <a:xfrm>
+                      <a:off x="0" y="0"/>
+                      <a:ext cx="5120640" cy="2667234"/>
+                    </a:xfrm>
+                    <a:prstGeom prst="rect">
+                      <a:avLst/>
+                    </a:prstGeom>
+                  </pic:spPr>
+                </pic:pic>
+              </a:graphicData>
+            </a:graphic>
+          </wp:inline>
+        </w:drawing>
+      </w:r>
+    </w:p>
+    <w:p>
+      <w:r>
+        <w:rPr>
+          <w:b/>
+        </w:rPr>
+        <w:t xml:space="preserve">Result: </w:t>
+      </w:r>
+      <w:r>
+        <w:rPr>
+          <w:b/>
+        </w:rPr>
+        <w:t xml:space="preserve">Data / Business Analyst (4,020) and Data Engineer (3,916)</w:t>
+      </w:r>
+      <w:r>
+        <w:t xml:space="preserve"> have the most openings, more than twice as many as Data Scientist (1,716). ML / AI Engineer jobs are few (212).</w:t>
+      </w:r>
+    </w:p>
+    <w:p>
+      <w:r>
+        <w:rPr>
+          <w:b/>
+        </w:rPr>
+        <w:t xml:space="preserve">Chart 4 — Jobs by Experience Level</w:t>
+      </w:r>
+    </w:p>
+    <w:p>
+      <w:pPr>
+        <w:jc w:val="center"/>
+      </w:pPr>
+      <w:r>
+        <w:drawing>
+          <wp:inline distT="0" distB="0" distL="0" distR="0">
+            <wp:extent cx="4389120" cy="2946803"/>
+            <wp:docPr id="104" name="Chart 4"/>
+            <wp:cNvGraphicFramePr>
+              <a:graphicFrameLocks xmlns:a="http://schemas.openxmlformats.org/drawingml/2006/main" noChangeAspect="1"/>
+            </wp:cNvGraphicFramePr>
+            <a:graphic xmlns:a="http://schemas.openxmlformats.org/drawingml/2006/main">
+              <a:graphicData uri="http://schemas.openxmlformats.org/drawingml/2006/picture">
+                <pic:pic xmlns:pic="http://schemas.openxmlformats.org/drawingml/2006/picture">
+                  <pic:nvPicPr>
+                    <pic:cNvPr id="0" name="chart4.png"/>
+                    <pic:cNvPicPr/>
+                  </pic:nvPicPr>
+                  <pic:blipFill>
+                    <a:blip r:embed="rIdImg4"/>
+                    <a:stretch>
+                      <a:fillRect/>
+                    </a:stretch>
+                  </pic:blipFill>
+                  <pic:spPr>
+                    <a:xfrm>
+                      <a:off x="0" y="0"/>
+                      <a:ext cx="4389120" cy="2946803"/>
+                    </a:xfrm>
+                    <a:prstGeom prst="rect">
+                      <a:avLst/>
+                    </a:prstGeom>
+                  </pic:spPr>
+                </pic:pic>
+              </a:graphicData>
+            </a:graphic>
+          </wp:inline>
+        </w:drawing>
+      </w:r>
+    </w:p>
+    <w:p>
+      <w:r>
+        <w:rPr>
+          <w:b/>
+        </w:rPr>
+        <w:t xml:space="preserve">Result: </w:t>
+      </w:r>
+      <w:r>
+        <w:t xml:space="preserve">Most jobs ask for 2 to 6 years of experience. </w:t>
+      </w:r>
+      <w:r>
+        <w:rPr>
+          <w:b/>
+        </w:rPr>
+        <w:t xml:space="preserve">Only 1,480 jobs (about 12%) are open to freshers.</w:t>
+      </w:r>
+    </w:p>
+    <w:p>
+      <w:r>
+        <w:rPr>
+          <w:b/>
+        </w:rPr>
+        <w:t xml:space="preserve">Chart 5 — Top 10 Skills for Fresher Jobs</w:t>
+      </w:r>
+    </w:p>
+    <w:p>
+      <w:pPr>
+        <w:jc w:val="center"/>
+      </w:pPr>
+      <w:r>
+        <w:drawing>
+          <wp:inline distT="0" distB="0" distL="0" distR="0">
+            <wp:extent cx="5120640" cy="2536242"/>
+            <wp:docPr id="105" name="Chart 5"/>
+            <wp:cNvGraphicFramePr>
+              <a:graphicFrameLocks xmlns:a="http://schemas.openxmlformats.org/drawingml/2006/main" noChangeAspect="1"/>
+            </wp:cNvGraphicFramePr>
+            <a:graphic xmlns:a="http://schemas.openxmlformats.org/drawingml/2006/main">
+              <a:graphicData uri="http://schemas.openxmlformats.org/drawingml/2006/picture">
+                <pic:pic xmlns:pic="http://schemas.openxmlformats.org/drawingml/2006/picture">
+                  <pic:nvPicPr>
+                    <pic:cNvPr id="0" name="chart5.png"/>
+                    <pic:cNvPicPr/>
+                  </pic:nvPicPr>
+                  <pic:blipFill>
+                    <a:blip r:embed="rIdImg5"/>
+                    <a:stretch>
+                      <a:fillRect/>
+                    </a:stretch>
+                  </pic:blipFill>
+                  <pic:spPr>
+                    <a:xfrm>
+                      <a:off x="0" y="0"/>
+                      <a:ext cx="5120640" cy="2536242"/>
+                    </a:xfrm>
+                    <a:prstGeom prst="rect">
+                      <a:avLst/>
+                    </a:prstGeom>
+                  </pic:spPr>
+                </pic:pic>
+              </a:graphicData>
+            </a:graphic>
+          </wp:inline>
+        </w:drawing>
+      </w:r>
+    </w:p>
+    <w:p>
+      <w:r>
+        <w:rPr>
+          <w:b/>
+        </w:rPr>
+        <w:t xml:space="preserve">Result: </w:t>
+      </w:r>
+      <w:r>
+        <w:t xml:space="preserve">For fresher jobs, </w:t>
+      </w:r>
+      <w:r>
+        <w:rPr>
+          <w:b/>
+        </w:rPr>
+        <w:t xml:space="preserve">data analysis (334) and Python (305)</w:t>
+      </w:r>
+      <w:r>
+        <w:t xml:space="preserve"> are the top skills. </w:t>
+      </w:r>
+      <w:r>
+        <w:rPr>
+          <w:b/>
+        </w:rPr>
+        <w:t xml:space="preserve">Excel (160)</w:t>
+      </w:r>
+      <w:r>
+        <w:t xml:space="preserve"> appears here even though it is not in the overall top 15, so basic analysis tools matter more at entry level.</w:t>
       </w:r>
     </w:p>
     <w:p>
@@ -1972,17 +2447,12 @@
     </w:p>
     <w:p>
       <w:r>
-        <w:rPr>
-          <w:b/>
-        </w:rPr>
-        <w:t xml:space="preserve">Result: </w:t>
+        <w:t xml:space="preserve">In this experiment, raw job-posting data was turned into a clean, analysis-ready dataset. Wrong experience values and duplicate rows were removed, text was transformed into numbers and lists, different spellings of the same city were merged, and new columns such as Role, Experience_Level and the skill flags were created. The data was then selected with loc[] and iloc[], and filtered with conditions, isin() and query().</w:t>
       </w:r>
+    </w:p>
+    <w:p>
       <w:r>
-        <w:rPr>
-          <w:i/>
-          <w:color w:val="7F7F7F"/>
-        </w:rPr>
-        <w:t xml:space="preserve">to be written after the results are available.</w:t>
+        <w:t xml:space="preserve">These steps made better visualization possible. The city chart became correct only after cleaning, and charts such as top skills or jobs by experience level could not be drawn from the raw text at all. The results also give useful job-market insight: Python, data analysis and SQL are the key skills, Bengaluru, Hyderabad, Pune and Mumbai have the most openings, and fresher jobs also value Excel.</w:t>
       </w:r>
     </w:p>
     <w:sectPr>

</xml_diff>